<commit_message>
Add Section 6 Ontogenetic Scaling & Developmental Growth of Phi (N=4 to 10) to Paper and Notebook
</commit_message>
<xml_diff>
--- a/docs/The_Conative_Integrative_Framework_Thomas_Riebl.docx
+++ b/docs/The_Conative_Integrative_Framework_Thomas_Riebl.docx
@@ -2,7 +2,7 @@
 <file path=word/document.xml><?xml version="1.0" encoding="utf-8"?>
 <w:document xmlns:w="http://schemas.openxmlformats.org/wordprocessingml/2006/main" xmlns:m="http://schemas.openxmlformats.org/officeDocument/2006/math" xmlns:r="http://schemas.openxmlformats.org/officeDocument/2006/relationships" xmlns:o="urn:schemas-microsoft-com:office:office" xmlns:v="urn:schemas-microsoft-com:vml" xmlns:w10="urn:schemas-microsoft-com:office:word" xmlns:a="http://schemas.openxmlformats.org/drawingml/2006/main" xmlns:pic="http://schemas.openxmlformats.org/drawingml/2006/picture" xmlns:wp="http://schemas.openxmlformats.org/drawingml/2006/wordprocessingDrawing">
   <w:body>
-    <w:bookmarkStart w:id="49" w:name="the-conative-integrative-framework-cif"/>
+    <w:bookmarkStart w:id="54" w:name="the-conative-integrative-framework-cif"/>
     <w:p>
       <w:pPr>
         <w:pStyle w:val="Heading1"/>
@@ -350,12 +350,67 @@
           <w:numId w:val="1001"/>
         </w:numPr>
       </w:pPr>
-      <w:hyperlink w:anchor="X79ae71bbe89eaa2c77ce6919e0f8668a553af5e">
+      <w:hyperlink w:anchor="X3d0741f93ddf92d844b7b5da827e483e4eff5fd">
         <w:r>
           <w:rPr>
             <w:rStyle w:val="Hyperlink"/>
           </w:rPr>
-          <w:t xml:space="preserve">6. Conclusion: The Unified Science of Mind</w:t>
+          <w:t xml:space="preserve">6. Ontogenetic Scaling &amp; Developmental Growth of</w:t>
+        </w:r>
+        <w:r>
+          <w:rPr>
+            <w:rStyle w:val="Hyperlink"/>
+          </w:rPr>
+          <w:t xml:space="preserve"> </w:t>
+        </w:r>
+        <m:oMath>
+          <m:r>
+            <m:rPr>
+              <m:sty m:val="p"/>
+            </m:rPr>
+            <m:t>Φ</m:t>
+          </m:r>
+        </m:oMath>
+        <w:r>
+          <w:rPr>
+            <w:rStyle w:val="Hyperlink"/>
+          </w:rPr>
+          <w:t xml:space="preserve"> </w:t>
+        </w:r>
+        <w:r>
+          <w:rPr>
+            <w:rStyle w:val="Hyperlink"/>
+          </w:rPr>
+          <w:t xml:space="preserve">(</w:t>
+        </w:r>
+        <m:oMath>
+          <m:r>
+            <m:t>N</m:t>
+          </m:r>
+          <m:r>
+            <m:rPr>
+              <m:sty m:val="p"/>
+            </m:rPr>
+            <m:t>=</m:t>
+          </m:r>
+          <m:r>
+            <m:t>4</m:t>
+          </m:r>
+          <m:r>
+            <m:rPr>
+              <m:sty m:val="p"/>
+            </m:rPr>
+            <m:t>→</m:t>
+          </m:r>
+          <m:r>
+            <m:t>10</m:t>
+          </m:r>
+        </m:oMath>
+        <w:r>
+          <w:rPr>
+            <w:rStyle w:val="Hyperlink"/>
+          </w:rPr>
+          <w:t xml:space="preserve">)</w:t>
         </w:r>
       </w:hyperlink>
     </w:p>
@@ -367,12 +422,12 @@
           <w:numId w:val="1001"/>
         </w:numPr>
       </w:pPr>
-      <w:hyperlink w:anchor="X12b8c24ff07f4715474ee8e08480e3657266d8f">
+      <w:hyperlink w:anchor="X7b012702160a1f58145d222b1abd811b66f9780">
         <w:r>
           <w:rPr>
             <w:rStyle w:val="Hyperlink"/>
           </w:rPr>
-          <w:t xml:space="preserve">7. References &amp; Academic Bibliography</w:t>
+          <w:t xml:space="preserve">7. Conclusion: The Unified Science of Mind</w:t>
         </w:r>
       </w:hyperlink>
     </w:p>
@@ -384,12 +439,29 @@
           <w:numId w:val="1001"/>
         </w:numPr>
       </w:pPr>
-      <w:hyperlink w:anchor="X104d46987186aa5bae9f91b004cc1484b8f45fc">
+      <w:hyperlink w:anchor="X2684d4a33decb7b52f3486c4cce4f9476c2b7ae">
         <w:r>
           <w:rPr>
             <w:rStyle w:val="Hyperlink"/>
           </w:rPr>
-          <w:t xml:space="preserve">8. Tool Attribution &amp; Colophon</w:t>
+          <w:t xml:space="preserve">8. References &amp; Academic Bibliography</w:t>
+        </w:r>
+      </w:hyperlink>
+    </w:p>
+    <w:p>
+      <w:pPr>
+        <w:pStyle w:val="Compact"/>
+        <w:numPr>
+          <w:ilvl w:val="0"/>
+          <w:numId w:val="1001"/>
+        </w:numPr>
+      </w:pPr>
+      <w:hyperlink w:anchor="Xa0fc30b0096595cd78b8d31cff6515ce2283a98">
+        <w:r>
+          <w:rPr>
+            <w:rStyle w:val="Hyperlink"/>
+          </w:rPr>
+          <w:t xml:space="preserve">9. Tool Attribution &amp; Colophon</w:t>
         </w:r>
       </w:hyperlink>
     </w:p>
@@ -3767,13 +3839,1059 @@
     </w:p>
     <w:bookmarkEnd w:id="39"/>
     <w:bookmarkEnd w:id="40"/>
-    <w:bookmarkStart w:id="41" w:name="conclusion-the-unified-science-of-mind"/>
+    <w:bookmarkStart w:id="45" w:name="Xc5b4ac076ce85c423359a7b05e82fcec2c2913c"/>
     <w:p>
       <w:pPr>
         <w:pStyle w:val="Heading2"/>
       </w:pPr>
       <w:r>
-        <w:t xml:space="preserve">6. Conclusion: The Unified Science of Mind</w:t>
+        <w:t xml:space="preserve">6. Ontogenetic Scaling &amp; Developmental Growth of</w:t>
+      </w:r>
+      <w:r>
+        <w:t xml:space="preserve"> </w:t>
+      </w:r>
+      <m:oMath>
+        <m:r>
+          <m:rPr>
+            <m:sty m:val="p"/>
+          </m:rPr>
+          <m:t>Φ</m:t>
+        </m:r>
+      </m:oMath>
+      <w:r>
+        <w:t xml:space="preserve"> </w:t>
+      </w:r>
+      <w:r>
+        <w:t xml:space="preserve">(</w:t>
+      </w:r>
+      <m:oMath>
+        <m:r>
+          <m:t>N</m:t>
+        </m:r>
+        <m:r>
+          <m:rPr>
+            <m:sty m:val="p"/>
+          </m:rPr>
+          <m:t>=</m:t>
+        </m:r>
+        <m:r>
+          <m:t>4</m:t>
+        </m:r>
+        <m:r>
+          <m:rPr>
+            <m:sty m:val="p"/>
+          </m:rPr>
+          <m:t>→</m:t>
+        </m:r>
+        <m:r>
+          <m:t>10</m:t>
+        </m:r>
+      </m:oMath>
+      <w:r>
+        <w:t xml:space="preserve">)</w:t>
+      </w:r>
+    </w:p>
+    <w:p>
+      <w:pPr>
+        <w:pStyle w:val="FirstParagraph"/>
+      </w:pPr>
+      <w:r>
+        <w:t xml:space="preserve">To investigate how consciousness develops during biological growth, synaptogenesis, and network expansion, we extended our discrete Active Inference architecture into an</w:t>
+      </w:r>
+      <w:r>
+        <w:t xml:space="preserve"> </w:t>
+      </w:r>
+      <w:r>
+        <w:rPr>
+          <w:b/>
+          <w:bCs/>
+        </w:rPr>
+        <w:t xml:space="preserve">Expanding Autopoietic Mesh</w:t>
+      </w:r>
+      <w:r>
+        <w:t xml:space="preserve"> </w:t>
+      </w:r>
+      <w:r>
+        <w:t xml:space="preserve">(</w:t>
+      </w:r>
+      <w:r>
+        <w:rPr>
+          <w:rStyle w:val="VerbatimChar"/>
+        </w:rPr>
+        <w:t xml:space="preserve">ExpandingActiveInferenceNetwork</w:t>
+      </w:r>
+      <w:r>
+        <w:t xml:space="preserve">).</w:t>
+      </w:r>
+    </w:p>
+    <w:p>
+      <w:pPr>
+        <w:pStyle w:val="BodyText"/>
+      </w:pPr>
+      <w:r>
+        <w:t xml:space="preserve">The simulation begins with</w:t>
+      </w:r>
+      <w:r>
+        <w:t xml:space="preserve"> </w:t>
+      </w:r>
+      <m:oMath>
+        <m:r>
+          <m:t>N</m:t>
+        </m:r>
+        <m:r>
+          <m:rPr>
+            <m:sty m:val="p"/>
+          </m:rPr>
+          <m:t>=</m:t>
+        </m:r>
+        <m:r>
+          <m:t>4</m:t>
+        </m:r>
+      </m:oMath>
+      <w:r>
+        <w:t xml:space="preserve"> </w:t>
+      </w:r>
+      <w:r>
+        <w:t xml:space="preserve">agents and progressively injects new agents across discrete developmental stages:</w:t>
+      </w:r>
+      <w:r>
+        <w:t xml:space="preserve"> </w:t>
+      </w:r>
+      <w:r>
+        <w:t xml:space="preserve">*</w:t>
+      </w:r>
+      <w:r>
+        <w:t xml:space="preserve"> </w:t>
+      </w:r>
+      <w:r>
+        <w:rPr>
+          <w:b/>
+          <w:bCs/>
+        </w:rPr>
+        <w:t xml:space="preserve">Stage 1 (</w:t>
+      </w:r>
+      <m:oMath>
+        <m:r>
+          <m:t>t</m:t>
+        </m:r>
+        <m:r>
+          <m:rPr>
+            <m:sty m:val="p"/>
+          </m:rPr>
+          <m:t>=</m:t>
+        </m:r>
+        <m:r>
+          <m:t>0</m:t>
+        </m:r>
+        <m:r>
+          <m:rPr>
+            <m:sty m:val="p"/>
+          </m:rPr>
+          <m:t>…</m:t>
+        </m:r>
+        <m:r>
+          <m:t>45</m:t>
+        </m:r>
+      </m:oMath>
+      <w:r>
+        <w:rPr>
+          <w:b/>
+          <w:bCs/>
+        </w:rPr>
+        <w:t xml:space="preserve">):</w:t>
+      </w:r>
+      <w:r>
+        <w:t xml:space="preserve"> </w:t>
+      </w:r>
+      <w:r>
+        <w:t xml:space="preserve">Baseline network (</w:t>
+      </w:r>
+      <m:oMath>
+        <m:r>
+          <m:t>N</m:t>
+        </m:r>
+        <m:r>
+          <m:rPr>
+            <m:sty m:val="p"/>
+          </m:rPr>
+          <m:t>=</m:t>
+        </m:r>
+        <m:r>
+          <m:t>4</m:t>
+        </m:r>
+      </m:oMath>
+      <w:r>
+        <w:t xml:space="preserve">)</w:t>
+      </w:r>
+      <w:r>
+        <w:t xml:space="preserve"> </w:t>
+      </w:r>
+      <w:r>
+        <w:t xml:space="preserve">*</w:t>
+      </w:r>
+      <w:r>
+        <w:t xml:space="preserve"> </w:t>
+      </w:r>
+      <w:r>
+        <w:rPr>
+          <w:b/>
+          <w:bCs/>
+        </w:rPr>
+        <w:t xml:space="preserve">Stage 2 (</w:t>
+      </w:r>
+      <m:oMath>
+        <m:r>
+          <m:t>t</m:t>
+        </m:r>
+        <m:r>
+          <m:rPr>
+            <m:sty m:val="p"/>
+          </m:rPr>
+          <m:t>=</m:t>
+        </m:r>
+        <m:r>
+          <m:t>45</m:t>
+        </m:r>
+        <m:r>
+          <m:rPr>
+            <m:sty m:val="p"/>
+          </m:rPr>
+          <m:t>…</m:t>
+        </m:r>
+        <m:r>
+          <m:t>90</m:t>
+        </m:r>
+      </m:oMath>
+      <w:r>
+        <w:rPr>
+          <w:b/>
+          <w:bCs/>
+        </w:rPr>
+        <w:t xml:space="preserve">):</w:t>
+      </w:r>
+      <w:r>
+        <w:t xml:space="preserve"> </w:t>
+      </w:r>
+      <w:r>
+        <w:t xml:space="preserve">Ingestion of 2 new agents</w:t>
+      </w:r>
+      <w:r>
+        <w:t xml:space="preserve"> </w:t>
+      </w:r>
+      <m:oMath>
+        <m:r>
+          <m:rPr>
+            <m:sty m:val="p"/>
+          </m:rPr>
+          <m:t>⟹</m:t>
+        </m:r>
+        <m:r>
+          <m:t>N</m:t>
+        </m:r>
+        <m:r>
+          <m:rPr>
+            <m:sty m:val="p"/>
+          </m:rPr>
+          <m:t>=</m:t>
+        </m:r>
+        <m:r>
+          <m:t>6</m:t>
+        </m:r>
+      </m:oMath>
+      <w:r>
+        <w:t xml:space="preserve"> </w:t>
+      </w:r>
+      <w:r>
+        <w:t xml:space="preserve">*</w:t>
+      </w:r>
+      <w:r>
+        <w:t xml:space="preserve"> </w:t>
+      </w:r>
+      <w:r>
+        <w:rPr>
+          <w:b/>
+          <w:bCs/>
+        </w:rPr>
+        <w:t xml:space="preserve">Stage 3 (</w:t>
+      </w:r>
+      <m:oMath>
+        <m:r>
+          <m:t>t</m:t>
+        </m:r>
+        <m:r>
+          <m:rPr>
+            <m:sty m:val="p"/>
+          </m:rPr>
+          <m:t>=</m:t>
+        </m:r>
+        <m:r>
+          <m:t>90</m:t>
+        </m:r>
+        <m:r>
+          <m:rPr>
+            <m:sty m:val="p"/>
+          </m:rPr>
+          <m:t>…</m:t>
+        </m:r>
+        <m:r>
+          <m:t>135</m:t>
+        </m:r>
+      </m:oMath>
+      <w:r>
+        <w:rPr>
+          <w:b/>
+          <w:bCs/>
+        </w:rPr>
+        <w:t xml:space="preserve">):</w:t>
+      </w:r>
+      <w:r>
+        <w:t xml:space="preserve"> </w:t>
+      </w:r>
+      <w:r>
+        <w:t xml:space="preserve">Ingestion of 2 new agents</w:t>
+      </w:r>
+      <w:r>
+        <w:t xml:space="preserve"> </w:t>
+      </w:r>
+      <m:oMath>
+        <m:r>
+          <m:rPr>
+            <m:sty m:val="p"/>
+          </m:rPr>
+          <m:t>⟹</m:t>
+        </m:r>
+        <m:r>
+          <m:t>N</m:t>
+        </m:r>
+        <m:r>
+          <m:rPr>
+            <m:sty m:val="p"/>
+          </m:rPr>
+          <m:t>=</m:t>
+        </m:r>
+        <m:r>
+          <m:t>8</m:t>
+        </m:r>
+      </m:oMath>
+      <w:r>
+        <w:t xml:space="preserve"> </w:t>
+      </w:r>
+      <w:r>
+        <w:t xml:space="preserve">*</w:t>
+      </w:r>
+      <w:r>
+        <w:t xml:space="preserve"> </w:t>
+      </w:r>
+      <w:r>
+        <w:rPr>
+          <w:b/>
+          <w:bCs/>
+        </w:rPr>
+        <w:t xml:space="preserve">Stage 4 (</w:t>
+      </w:r>
+      <m:oMath>
+        <m:r>
+          <m:t>t</m:t>
+        </m:r>
+        <m:r>
+          <m:rPr>
+            <m:sty m:val="p"/>
+          </m:rPr>
+          <m:t>=</m:t>
+        </m:r>
+        <m:r>
+          <m:t>135</m:t>
+        </m:r>
+        <m:r>
+          <m:rPr>
+            <m:sty m:val="p"/>
+          </m:rPr>
+          <m:t>…</m:t>
+        </m:r>
+        <m:r>
+          <m:t>180</m:t>
+        </m:r>
+      </m:oMath>
+      <w:r>
+        <w:rPr>
+          <w:b/>
+          <w:bCs/>
+        </w:rPr>
+        <w:t xml:space="preserve">):</w:t>
+      </w:r>
+      <w:r>
+        <w:t xml:space="preserve"> </w:t>
+      </w:r>
+      <w:r>
+        <w:t xml:space="preserve">Ingestion of 2 new agents</w:t>
+      </w:r>
+      <w:r>
+        <w:t xml:space="preserve"> </w:t>
+      </w:r>
+      <m:oMath>
+        <m:r>
+          <m:rPr>
+            <m:sty m:val="p"/>
+          </m:rPr>
+          <m:t>⟹</m:t>
+        </m:r>
+        <m:r>
+          <m:t>N</m:t>
+        </m:r>
+        <m:r>
+          <m:rPr>
+            <m:sty m:val="p"/>
+          </m:rPr>
+          <m:t>=</m:t>
+        </m:r>
+        <m:r>
+          <m:t>10</m:t>
+        </m:r>
+      </m:oMath>
+    </w:p>
+    <w:p>
+      <w:pPr>
+        <w:pStyle w:val="CaptionedFigure"/>
+      </w:pPr>
+      <w:r>
+        <w:drawing>
+          <wp:inline>
+            <wp:extent cx="5334000" cy="4180032"/>
+            <wp:effectExtent b="0" l="0" r="0" t="0"/>
+            <wp:docPr descr="Active Inference Expanding Network Phi Scaling" title="" id="42" name="Picture"/>
+            <a:graphic>
+              <a:graphicData uri="http://schemas.openxmlformats.org/drawingml/2006/picture">
+                <pic:pic>
+                  <pic:nvPicPr>
+                    <pic:cNvPr descr="/home/thr/Documents/active-inference-phi-network/images/active_inference_expanding_network_phi_scaling.png" id="43" name="Picture"/>
+                    <pic:cNvPicPr>
+                      <a:picLocks noChangeArrowheads="1" noChangeAspect="1"/>
+                    </pic:cNvPicPr>
+                  </pic:nvPicPr>
+                  <pic:blipFill>
+                    <a:blip r:embed="rId41"/>
+                    <a:stretch>
+                      <a:fillRect/>
+                    </a:stretch>
+                  </pic:blipFill>
+                  <pic:spPr bwMode="auto">
+                    <a:xfrm>
+                      <a:off x="0" y="0"/>
+                      <a:ext cx="5334000" cy="4180032"/>
+                    </a:xfrm>
+                    <a:prstGeom prst="rect">
+                      <a:avLst/>
+                    </a:prstGeom>
+                    <a:noFill/>
+                    <a:ln w="9525">
+                      <a:noFill/>
+                      <a:headEnd/>
+                      <a:tailEnd/>
+                    </a:ln>
+                  </pic:spPr>
+                </pic:pic>
+              </a:graphicData>
+            </a:graphic>
+          </wp:inline>
+        </w:drawing>
+      </w:r>
+    </w:p>
+    <w:p>
+      <w:pPr>
+        <w:pStyle w:val="ImageCaption"/>
+      </w:pPr>
+      <w:r>
+        <w:t xml:space="preserve">Active Inference Expanding Network Phi Scaling</w:t>
+      </w:r>
+    </w:p>
+    <w:bookmarkStart w:id="44" w:name="X977b19f1966dbf6af12466af8f56919f60c52fa"/>
+    <w:p>
+      <w:pPr>
+        <w:pStyle w:val="Heading3"/>
+      </w:pPr>
+      <w:r>
+        <w:t xml:space="preserve">The Three Discoveries of Developmental Expansion:</w:t>
+      </w:r>
+    </w:p>
+    <w:p>
+      <w:pPr>
+        <w:numPr>
+          <w:ilvl w:val="0"/>
+          <w:numId w:val="1008"/>
+        </w:numPr>
+      </w:pPr>
+      <w:r>
+        <w:rPr>
+          <w:b/>
+          <w:bCs/>
+        </w:rPr>
+        <w:t xml:space="preserve">Perturbation Dips &amp; Autopoietic Resilience:</w:t>
+      </w:r>
+      <w:r>
+        <w:br/>
+      </w:r>
+      <w:r>
+        <w:t xml:space="preserve">At each injection timestep (</w:t>
+      </w:r>
+      <m:oMath>
+        <m:r>
+          <m:t>t</m:t>
+        </m:r>
+        <m:r>
+          <m:rPr>
+            <m:sty m:val="p"/>
+          </m:rPr>
+          <m:t>=</m:t>
+        </m:r>
+        <m:r>
+          <m:t>45</m:t>
+        </m:r>
+        <m:r>
+          <m:rPr>
+            <m:sty m:val="p"/>
+          </m:rPr>
+          <m:t>,</m:t>
+        </m:r>
+        <m:r>
+          <m:t>90</m:t>
+        </m:r>
+        <m:r>
+          <m:rPr>
+            <m:sty m:val="p"/>
+          </m:rPr>
+          <m:t>,</m:t>
+        </m:r>
+        <m:r>
+          <m:t>135</m:t>
+        </m:r>
+      </m:oMath>
+      <w:r>
+        <w:t xml:space="preserve">), the entry of uncalibrated, naive agents momentarily elevates entropy and disrupts existing phase coherence, causing</w:t>
+      </w:r>
+      <w:r>
+        <w:t xml:space="preserve"> </w:t>
+      </w:r>
+      <m:oMath>
+        <m:r>
+          <m:rPr>
+            <m:sty m:val="p"/>
+          </m:rPr>
+          <m:t>Φ</m:t>
+        </m:r>
+        <m:r>
+          <m:rPr>
+            <m:sty m:val="p"/>
+          </m:rPr>
+          <m:t>(</m:t>
+        </m:r>
+        <m:r>
+          <m:t>t</m:t>
+        </m:r>
+        <m:r>
+          <m:rPr>
+            <m:sty m:val="p"/>
+          </m:rPr>
+          <m:t>)</m:t>
+        </m:r>
+      </m:oMath>
+      <w:r>
+        <w:t xml:space="preserve"> </w:t>
+      </w:r>
+      <w:r>
+        <w:t xml:space="preserve">to briefly drop towards zero. However, driven by</w:t>
+      </w:r>
+      <w:r>
+        <w:t xml:space="preserve"> </w:t>
+      </w:r>
+      <w:r>
+        <w:rPr>
+          <w:b/>
+          <w:bCs/>
+        </w:rPr>
+        <w:t xml:space="preserve">Expected Free Energy (</w:t>
+      </w:r>
+      <m:oMath>
+        <m:r>
+          <m:t>G</m:t>
+        </m:r>
+      </m:oMath>
+      <w:r>
+        <w:rPr>
+          <w:b/>
+          <w:bCs/>
+        </w:rPr>
+        <w:t xml:space="preserve">) minimization</w:t>
+      </w:r>
+      <w:r>
+        <w:t xml:space="preserve"> </w:t>
+      </w:r>
+      <w:r>
+        <w:t xml:space="preserve">and local message passing, the network rapidly assimilates the new nodes within 10–15 timesteps. This confirms the</w:t>
+      </w:r>
+      <w:r>
+        <w:t xml:space="preserve"> </w:t>
+      </w:r>
+      <w:r>
+        <w:rPr>
+          <w:b/>
+          <w:bCs/>
+        </w:rPr>
+        <w:t xml:space="preserve">6th Axiom of Autopoietic Causal Persistence</w:t>
+      </w:r>
+      <w:r>
+        <w:t xml:space="preserve"> </w:t>
+      </w:r>
+      <w:r>
+        <w:t xml:space="preserve">under structural expansion: the system actively defends and re-establishes its causal boundary.</w:t>
+      </w:r>
+    </w:p>
+    <w:p>
+      <w:pPr>
+        <w:numPr>
+          <w:ilvl w:val="0"/>
+          <w:numId w:val="1008"/>
+        </w:numPr>
+      </w:pPr>
+      <w:r>
+        <w:rPr>
+          <w:b/>
+          <w:bCs/>
+        </w:rPr>
+        <w:t xml:space="preserve">Superlinear Capacity Scaling (</w:t>
+      </w:r>
+      <m:oMath>
+        <m:acc>
+          <m:accPr>
+            <m:chr m:val="‾"/>
+          </m:accPr>
+          <m:e>
+            <m:r>
+              <m:rPr>
+                <m:sty m:val="p"/>
+              </m:rPr>
+              <m:t>Φ</m:t>
+            </m:r>
+          </m:e>
+        </m:acc>
+        <m:r>
+          <m:rPr>
+            <m:sty m:val="p"/>
+          </m:rPr>
+          <m:t>(</m:t>
+        </m:r>
+        <m:r>
+          <m:t>N</m:t>
+        </m:r>
+        <m:r>
+          <m:rPr>
+            <m:sty m:val="p"/>
+          </m:rPr>
+          <m:t>)</m:t>
+        </m:r>
+      </m:oMath>
+      <w:r>
+        <w:rPr>
+          <w:b/>
+          <w:bCs/>
+        </w:rPr>
+        <w:t xml:space="preserve">):</w:t>
+      </w:r>
+      <w:r>
+        <w:br/>
+      </w:r>
+      <w:r>
+        <w:t xml:space="preserve">Integrated Information scales non-linearly with network size:</w:t>
+      </w:r>
+    </w:p>
+    <w:p>
+      <w:pPr>
+        <w:pStyle w:val="BodyText"/>
+      </w:pPr>
+      <m:oMathPara>
+        <m:oMathParaPr>
+          <m:jc m:val="center"/>
+        </m:oMathParaPr>
+        <m:oMath>
+          <m:acc>
+            <m:accPr>
+              <m:chr m:val="‾"/>
+            </m:accPr>
+            <m:e>
+              <m:r>
+                <m:rPr>
+                  <m:sty m:val="p"/>
+                </m:rPr>
+                <m:t>Φ</m:t>
+              </m:r>
+            </m:e>
+          </m:acc>
+          <m:r>
+            <m:rPr>
+              <m:sty m:val="p"/>
+            </m:rPr>
+            <m:t>(</m:t>
+          </m:r>
+          <m:r>
+            <m:t>N</m:t>
+          </m:r>
+          <m:r>
+            <m:rPr>
+              <m:sty m:val="p"/>
+            </m:rPr>
+            <m:t>=</m:t>
+          </m:r>
+          <m:r>
+            <m:t>4</m:t>
+          </m:r>
+          <m:r>
+            <m:rPr>
+              <m:sty m:val="p"/>
+            </m:rPr>
+            <m:t>)</m:t>
+          </m:r>
+          <m:r>
+            <m:rPr>
+              <m:sty m:val="p"/>
+            </m:rPr>
+            <m:t>≈</m:t>
+          </m:r>
+          <m:r>
+            <m:t>0.219</m:t>
+          </m:r>
+          <m:r>
+            <m:t> </m:t>
+          </m:r>
+          <m:r>
+            <m:rPr>
+              <m:sty m:val="p"/>
+            </m:rPr>
+            <m:t>→</m:t>
+          </m:r>
+          <m:r>
+            <m:t> </m:t>
+          </m:r>
+          <m:acc>
+            <m:accPr>
+              <m:chr m:val="‾"/>
+            </m:accPr>
+            <m:e>
+              <m:r>
+                <m:rPr>
+                  <m:sty m:val="p"/>
+                </m:rPr>
+                <m:t>Φ</m:t>
+              </m:r>
+            </m:e>
+          </m:acc>
+          <m:r>
+            <m:rPr>
+              <m:sty m:val="p"/>
+            </m:rPr>
+            <m:t>(</m:t>
+          </m:r>
+          <m:r>
+            <m:t>N</m:t>
+          </m:r>
+          <m:r>
+            <m:rPr>
+              <m:sty m:val="p"/>
+            </m:rPr>
+            <m:t>=</m:t>
+          </m:r>
+          <m:r>
+            <m:t>6</m:t>
+          </m:r>
+          <m:r>
+            <m:rPr>
+              <m:sty m:val="p"/>
+            </m:rPr>
+            <m:t>)</m:t>
+          </m:r>
+          <m:r>
+            <m:rPr>
+              <m:sty m:val="p"/>
+            </m:rPr>
+            <m:t>≈</m:t>
+          </m:r>
+          <m:r>
+            <m:t>0.379</m:t>
+          </m:r>
+          <m:r>
+            <m:t> </m:t>
+          </m:r>
+          <m:r>
+            <m:rPr>
+              <m:sty m:val="p"/>
+            </m:rPr>
+            <m:t>→</m:t>
+          </m:r>
+          <m:r>
+            <m:t> </m:t>
+          </m:r>
+          <m:acc>
+            <m:accPr>
+              <m:chr m:val="‾"/>
+            </m:accPr>
+            <m:e>
+              <m:r>
+                <m:rPr>
+                  <m:sty m:val="p"/>
+                </m:rPr>
+                <m:t>Φ</m:t>
+              </m:r>
+            </m:e>
+          </m:acc>
+          <m:r>
+            <m:rPr>
+              <m:sty m:val="p"/>
+            </m:rPr>
+            <m:t>(</m:t>
+          </m:r>
+          <m:r>
+            <m:t>N</m:t>
+          </m:r>
+          <m:r>
+            <m:rPr>
+              <m:sty m:val="p"/>
+            </m:rPr>
+            <m:t>=</m:t>
+          </m:r>
+          <m:r>
+            <m:t>8</m:t>
+          </m:r>
+          <m:r>
+            <m:rPr>
+              <m:sty m:val="p"/>
+            </m:rPr>
+            <m:t>)</m:t>
+          </m:r>
+          <m:r>
+            <m:rPr>
+              <m:sty m:val="p"/>
+            </m:rPr>
+            <m:t>≈</m:t>
+          </m:r>
+          <m:r>
+            <m:t>1.044</m:t>
+          </m:r>
+          <m:r>
+            <m:t> </m:t>
+          </m:r>
+          <m:r>
+            <m:rPr>
+              <m:sty m:val="p"/>
+            </m:rPr>
+            <m:t>→</m:t>
+          </m:r>
+          <m:r>
+            <m:t> </m:t>
+          </m:r>
+          <m:acc>
+            <m:accPr>
+              <m:chr m:val="‾"/>
+            </m:accPr>
+            <m:e>
+              <m:r>
+                <m:rPr>
+                  <m:sty m:val="p"/>
+                </m:rPr>
+                <m:t>Φ</m:t>
+              </m:r>
+            </m:e>
+          </m:acc>
+          <m:r>
+            <m:rPr>
+              <m:sty m:val="p"/>
+            </m:rPr>
+            <m:t>(</m:t>
+          </m:r>
+          <m:r>
+            <m:t>N</m:t>
+          </m:r>
+          <m:r>
+            <m:rPr>
+              <m:sty m:val="p"/>
+            </m:rPr>
+            <m:t>=</m:t>
+          </m:r>
+          <m:r>
+            <m:t>10</m:t>
+          </m:r>
+          <m:r>
+            <m:rPr>
+              <m:sty m:val="p"/>
+            </m:rPr>
+            <m:t>)</m:t>
+          </m:r>
+          <m:r>
+            <m:rPr>
+              <m:sty m:val="p"/>
+            </m:rPr>
+            <m:t>≈</m:t>
+          </m:r>
+          <m:r>
+            <m:t>1.380</m:t>
+          </m:r>
+        </m:oMath>
+      </m:oMathPara>
+    </w:p>
+    <w:p>
+      <w:pPr>
+        <w:numPr>
+          <w:ilvl w:val="0"/>
+          <w:numId w:val="1000"/>
+        </w:numPr>
+      </w:pPr>
+      <w:r>
+        <w:t xml:space="preserve">The significant jump at</w:t>
+      </w:r>
+      <w:r>
+        <w:t xml:space="preserve"> </w:t>
+      </w:r>
+      <m:oMath>
+        <m:r>
+          <m:t>N</m:t>
+        </m:r>
+        <m:r>
+          <m:rPr>
+            <m:sty m:val="p"/>
+          </m:rPr>
+          <m:t>≥</m:t>
+        </m:r>
+        <m:r>
+          <m:t>8</m:t>
+        </m:r>
+      </m:oMath>
+      <w:r>
+        <w:t xml:space="preserve"> </w:t>
+      </w:r>
+      <w:r>
+        <w:t xml:space="preserve">occurs when the small-world forward cross-links (</w:t>
+      </w:r>
+      <m:oMath>
+        <m:sSub>
+          <m:e>
+            <m:r>
+              <m:t>W</m:t>
+            </m:r>
+          </m:e>
+          <m:sub>
+            <m:r>
+              <m:rPr>
+                <m:nor/>
+                <m:sty m:val="p"/>
+              </m:rPr>
+              <m:t>cross</m:t>
+            </m:r>
+          </m:sub>
+        </m:sSub>
+        <m:r>
+          <m:rPr>
+            <m:sty m:val="p"/>
+          </m:rPr>
+          <m:t>=</m:t>
+        </m:r>
+        <m:r>
+          <m:t>0.3</m:t>
+        </m:r>
+      </m:oMath>
+      <w:r>
+        <w:t xml:space="preserve">) form multi-node recurrent causal cliques, enabling synergistic cause-effect integration across the entire graph.</w:t>
+      </w:r>
+    </w:p>
+    <w:p>
+      <w:pPr>
+        <w:numPr>
+          <w:ilvl w:val="0"/>
+          <w:numId w:val="1008"/>
+        </w:numPr>
+      </w:pPr>
+      <w:r>
+        <w:rPr>
+          <w:b/>
+          <w:bCs/>
+        </w:rPr>
+        <w:t xml:space="preserve">Spatiotemporal Integration (Raster Analysis):</w:t>
+      </w:r>
+      <w:r>
+        <w:br/>
+      </w:r>
+      <w:r>
+        <w:t xml:space="preserve">The state raster (Panel C) demonstrates how newly recruited agents transition from passive silence into rich, coordinated oscillatory dynamics (</w:t>
+      </w:r>
+      <m:oMath>
+        <m:r>
+          <m:t>s</m:t>
+        </m:r>
+        <m:r>
+          <m:rPr>
+            <m:sty m:val="p"/>
+          </m:rPr>
+          <m:t>∈</m:t>
+        </m:r>
+        <m:r>
+          <m:rPr>
+            <m:sty m:val="p"/>
+          </m:rPr>
+          <m:t>{</m:t>
+        </m:r>
+        <m:r>
+          <m:t>0</m:t>
+        </m:r>
+        <m:r>
+          <m:rPr>
+            <m:sty m:val="p"/>
+          </m:rPr>
+          <m:t>,</m:t>
+        </m:r>
+        <m:r>
+          <m:t>1</m:t>
+        </m:r>
+        <m:r>
+          <m:rPr>
+            <m:sty m:val="p"/>
+          </m:rPr>
+          <m:t>,</m:t>
+        </m:r>
+        <m:r>
+          <m:t>2</m:t>
+        </m:r>
+        <m:r>
+          <m:rPr>
+            <m:sty m:val="p"/>
+          </m:rPr>
+          <m:t>,</m:t>
+        </m:r>
+        <m:r>
+          <m:t>3</m:t>
+        </m:r>
+        <m:r>
+          <m:rPr>
+            <m:sty m:val="p"/>
+          </m:rPr>
+          <m:t>}</m:t>
+        </m:r>
+      </m:oMath>
+      <w:r>
+        <w:t xml:space="preserve">), expanding the representational bandwidth of the collective Phenomenal Self-Model (PSM).</w:t>
+      </w:r>
+    </w:p>
+    <w:p>
+      <w:r>
+        <w:pict>
+          <v:rect style="width:0;height:1.5pt" o:hralign="center" o:hrstd="t" o:hr="t"/>
+        </w:pict>
+      </w:r>
+    </w:p>
+    <w:bookmarkEnd w:id="44"/>
+    <w:bookmarkEnd w:id="45"/>
+    <w:bookmarkStart w:id="46" w:name="conclusion-the-unified-science-of-mind"/>
+    <w:p>
+      <w:pPr>
+        <w:pStyle w:val="Heading2"/>
+      </w:pPr>
+      <w:r>
+        <w:t xml:space="preserve">7. Conclusion: The Unified Science of Mind</w:t>
       </w:r>
     </w:p>
     <w:p>
@@ -4333,617 +5451,14 @@
         </w:pict>
       </w:r>
     </w:p>
-    <w:bookmarkEnd w:id="41"/>
-    <w:bookmarkStart w:id="42" w:name="references-academic-bibliography"/>
+    <w:bookmarkEnd w:id="46"/>
+    <w:bookmarkStart w:id="47" w:name="references-academic-bibliography"/>
     <w:p>
       <w:pPr>
         <w:pStyle w:val="Heading2"/>
       </w:pPr>
       <w:r>
-        <w:t xml:space="preserve">7. References &amp; Academic Bibliography</w:t>
-      </w:r>
-    </w:p>
-    <w:p>
-      <w:pPr>
-        <w:pStyle w:val="Compact"/>
-        <w:numPr>
-          <w:ilvl w:val="0"/>
-          <w:numId w:val="1008"/>
-        </w:numPr>
-      </w:pPr>
-      <w:r>
-        <w:rPr>
-          <w:b/>
-          <w:bCs/>
-        </w:rPr>
-        <w:t xml:space="preserve">Albantakis, L., Barbosa, L., Findlay, G., Grasso, M., Haun, A. M., Marshall, W., Mayner, W. G., Saeed, A. B., &amp; Tononi, G. (2023).</w:t>
-      </w:r>
-      <w:r>
-        <w:t xml:space="preserve"> </w:t>
-      </w:r>
-      <w:r>
-        <w:rPr>
-          <w:i/>
-          <w:iCs/>
-        </w:rPr>
-        <w:t xml:space="preserve">Integrated information theory (IIT) 4.0: Formulating the properties of phenomenal existence in physical terms.</w:t>
-      </w:r>
-      <w:r>
-        <w:t xml:space="preserve"> </w:t>
-      </w:r>
-      <w:r>
-        <w:t xml:space="preserve">PLOS Computational Biology, 19(10), e1011465.</w:t>
-      </w:r>
-    </w:p>
-    <w:p>
-      <w:pPr>
-        <w:pStyle w:val="Compact"/>
-        <w:numPr>
-          <w:ilvl w:val="0"/>
-          <w:numId w:val="1008"/>
-        </w:numPr>
-      </w:pPr>
-      <w:r>
-        <w:rPr>
-          <w:b/>
-          <w:bCs/>
-        </w:rPr>
-        <w:t xml:space="preserve">Barrett, A. B., &amp; Seth, A. K. (2011).</w:t>
-      </w:r>
-      <w:r>
-        <w:t xml:space="preserve"> </w:t>
-      </w:r>
-      <w:r>
-        <w:rPr>
-          <w:i/>
-          <w:iCs/>
-        </w:rPr>
-        <w:t xml:space="preserve">Practical measures of integrated information for time-series data.</w:t>
-      </w:r>
-      <w:r>
-        <w:t xml:space="preserve"> </w:t>
-      </w:r>
-      <w:r>
-        <w:t xml:space="preserve">PLoS Computational Biology, 7(1), e1001052.</w:t>
-      </w:r>
-    </w:p>
-    <w:p>
-      <w:pPr>
-        <w:pStyle w:val="Compact"/>
-        <w:numPr>
-          <w:ilvl w:val="0"/>
-          <w:numId w:val="1008"/>
-        </w:numPr>
-      </w:pPr>
-      <w:r>
-        <w:rPr>
-          <w:b/>
-          <w:bCs/>
-        </w:rPr>
-        <w:t xml:space="preserve">Friston, K. (2010).</w:t>
-      </w:r>
-      <w:r>
-        <w:t xml:space="preserve"> </w:t>
-      </w:r>
-      <w:r>
-        <w:rPr>
-          <w:i/>
-          <w:iCs/>
-        </w:rPr>
-        <w:t xml:space="preserve">The free-energy principle: a unified brain theory?</w:t>
-      </w:r>
-      <w:r>
-        <w:t xml:space="preserve"> </w:t>
-      </w:r>
-      <w:r>
-        <w:t xml:space="preserve">Nature Reviews Neuroscience, 11(2), 127–138.</w:t>
-      </w:r>
-    </w:p>
-    <w:p>
-      <w:pPr>
-        <w:pStyle w:val="Compact"/>
-        <w:numPr>
-          <w:ilvl w:val="0"/>
-          <w:numId w:val="1008"/>
-        </w:numPr>
-      </w:pPr>
-      <w:r>
-        <w:rPr>
-          <w:b/>
-          <w:bCs/>
-        </w:rPr>
-        <w:t xml:space="preserve">Friston, K., FitzGerald, T., Rigoli, F., Schwartenbeck, P., &amp; Pezzulo, G. (2017).</w:t>
-      </w:r>
-      <w:r>
-        <w:t xml:space="preserve"> </w:t>
-      </w:r>
-      <w:r>
-        <w:rPr>
-          <w:i/>
-          <w:iCs/>
-        </w:rPr>
-        <w:t xml:space="preserve">Active Inference: A Process Theory.</w:t>
-      </w:r>
-      <w:r>
-        <w:t xml:space="preserve"> </w:t>
-      </w:r>
-      <w:r>
-        <w:t xml:space="preserve">Neural Computation, 29(1), 1–49.</w:t>
-      </w:r>
-    </w:p>
-    <w:p>
-      <w:pPr>
-        <w:pStyle w:val="Compact"/>
-        <w:numPr>
-          <w:ilvl w:val="0"/>
-          <w:numId w:val="1008"/>
-        </w:numPr>
-      </w:pPr>
-      <w:r>
-        <w:rPr>
-          <w:b/>
-          <w:bCs/>
-        </w:rPr>
-        <w:t xml:space="preserve">Kastrup, B. (2018).</w:t>
-      </w:r>
-      <w:r>
-        <w:t xml:space="preserve"> </w:t>
-      </w:r>
-      <w:r>
-        <w:rPr>
-          <w:i/>
-          <w:iCs/>
-        </w:rPr>
-        <w:t xml:space="preserve">Making Sense of the Mind-Body Relation: Why Dual-Aspect Monism Cannot Evade Analytic Idealism.</w:t>
-      </w:r>
-      <w:r>
-        <w:t xml:space="preserve"> </w:t>
-      </w:r>
-      <w:r>
-        <w:t xml:space="preserve">Theoria et Historia Scientiarum, 15, 63–82.</w:t>
-      </w:r>
-    </w:p>
-    <w:p>
-      <w:pPr>
-        <w:pStyle w:val="Compact"/>
-        <w:numPr>
-          <w:ilvl w:val="0"/>
-          <w:numId w:val="1008"/>
-        </w:numPr>
-      </w:pPr>
-      <w:r>
-        <w:rPr>
-          <w:b/>
-          <w:bCs/>
-        </w:rPr>
-        <w:t xml:space="preserve">Kastrup, B. (2019).</w:t>
-      </w:r>
-      <w:r>
-        <w:t xml:space="preserve"> </w:t>
-      </w:r>
-      <w:r>
-        <w:rPr>
-          <w:i/>
-          <w:iCs/>
-        </w:rPr>
-        <w:t xml:space="preserve">The Idea of the World: A Multi-Disciplinary Argument for the Mental Nature of Reality.</w:t>
-      </w:r>
-      <w:r>
-        <w:t xml:space="preserve"> </w:t>
-      </w:r>
-      <w:r>
-        <w:t xml:space="preserve">Iff Books.</w:t>
-      </w:r>
-    </w:p>
-    <w:p>
-      <w:pPr>
-        <w:pStyle w:val="Compact"/>
-        <w:numPr>
-          <w:ilvl w:val="0"/>
-          <w:numId w:val="1008"/>
-        </w:numPr>
-      </w:pPr>
-      <w:r>
-        <w:rPr>
-          <w:b/>
-          <w:bCs/>
-        </w:rPr>
-        <w:t xml:space="preserve">Koch, C. (2019).</w:t>
-      </w:r>
-      <w:r>
-        <w:t xml:space="preserve"> </w:t>
-      </w:r>
-      <w:r>
-        <w:rPr>
-          <w:i/>
-          <w:iCs/>
-        </w:rPr>
-        <w:t xml:space="preserve">The Feeling of Life Itself: Why Consciousness Is Widespread but Can’t Be Computed.</w:t>
-      </w:r>
-      <w:r>
-        <w:t xml:space="preserve"> </w:t>
-      </w:r>
-      <w:r>
-        <w:t xml:space="preserve">MIT Press.</w:t>
-      </w:r>
-    </w:p>
-    <w:p>
-      <w:pPr>
-        <w:pStyle w:val="Compact"/>
-        <w:numPr>
-          <w:ilvl w:val="0"/>
-          <w:numId w:val="1008"/>
-        </w:numPr>
-      </w:pPr>
-      <w:r>
-        <w:rPr>
-          <w:b/>
-          <w:bCs/>
-        </w:rPr>
-        <w:t xml:space="preserve">Metzinger, T. (2003).</w:t>
-      </w:r>
-      <w:r>
-        <w:t xml:space="preserve"> </w:t>
-      </w:r>
-      <w:r>
-        <w:rPr>
-          <w:i/>
-          <w:iCs/>
-        </w:rPr>
-        <w:t xml:space="preserve">Being No One: The Self-Model Theory of Subjectivity.</w:t>
-      </w:r>
-      <w:r>
-        <w:t xml:space="preserve"> </w:t>
-      </w:r>
-      <w:r>
-        <w:t xml:space="preserve">MIT Press.</w:t>
-      </w:r>
-    </w:p>
-    <w:p>
-      <w:pPr>
-        <w:pStyle w:val="Compact"/>
-        <w:numPr>
-          <w:ilvl w:val="0"/>
-          <w:numId w:val="1008"/>
-        </w:numPr>
-      </w:pPr>
-      <w:r>
-        <w:rPr>
-          <w:b/>
-          <w:bCs/>
-        </w:rPr>
-        <w:t xml:space="preserve">Metzinger, T. (2024).</w:t>
-      </w:r>
-      <w:r>
-        <w:t xml:space="preserve"> </w:t>
-      </w:r>
-      <w:r>
-        <w:rPr>
-          <w:i/>
-          <w:iCs/>
-        </w:rPr>
-        <w:t xml:space="preserve">The Elephant and the Blind: The Experience of Pure Consciousness: Philosophy, Science, and 500+ Experiential Reports.</w:t>
-      </w:r>
-      <w:r>
-        <w:t xml:space="preserve"> </w:t>
-      </w:r>
-      <w:r>
-        <w:t xml:space="preserve">MIT Press.</w:t>
-      </w:r>
-    </w:p>
-    <w:p>
-      <w:pPr>
-        <w:pStyle w:val="Compact"/>
-        <w:numPr>
-          <w:ilvl w:val="0"/>
-          <w:numId w:val="1008"/>
-        </w:numPr>
-      </w:pPr>
-      <w:r>
-        <w:rPr>
-          <w:b/>
-          <w:bCs/>
-        </w:rPr>
-        <w:t xml:space="preserve">Oizumi, M., Amari, S. I., Yanagawa, T., Fujii, N., &amp; Tsuchiya, N. (2016).</w:t>
-      </w:r>
-      <w:r>
-        <w:t xml:space="preserve"> </w:t>
-      </w:r>
-      <w:r>
-        <w:rPr>
-          <w:i/>
-          <w:iCs/>
-        </w:rPr>
-        <w:t xml:space="preserve">Measuring Integrated Information from the Decoding Perspective.</w:t>
-      </w:r>
-      <w:r>
-        <w:t xml:space="preserve"> </w:t>
-      </w:r>
-      <w:r>
-        <w:t xml:space="preserve">PLoS Computational Biology, 12(1), e1004654.</w:t>
-      </w:r>
-    </w:p>
-    <w:p>
-      <w:pPr>
-        <w:pStyle w:val="Compact"/>
-        <w:numPr>
-          <w:ilvl w:val="0"/>
-          <w:numId w:val="1008"/>
-        </w:numPr>
-      </w:pPr>
-      <w:r>
-        <w:rPr>
-          <w:b/>
-          <w:bCs/>
-        </w:rPr>
-        <w:t xml:space="preserve">Riebl, T. (2026).</w:t>
-      </w:r>
-      <w:r>
-        <w:t xml:space="preserve"> </w:t>
-      </w:r>
-      <w:r>
-        <w:rPr>
-          <w:i/>
-          <w:iCs/>
-        </w:rPr>
-        <w:t xml:space="preserve">Expanding IIT 4.0’s Axiom 0: The 6th Axiom of Autopoietic Causal Persistence (Will to Exist).</w:t>
-      </w:r>
-      <w:r>
-        <w:t xml:space="preserve"> </w:t>
-      </w:r>
-      <w:r>
-        <w:t xml:space="preserve">Working Paper &amp; Formal Proposal, Luxembourg.</w:t>
-      </w:r>
-    </w:p>
-    <w:p>
-      <w:pPr>
-        <w:pStyle w:val="Compact"/>
-        <w:numPr>
-          <w:ilvl w:val="0"/>
-          <w:numId w:val="1008"/>
-        </w:numPr>
-      </w:pPr>
-      <w:r>
-        <w:rPr>
-          <w:b/>
-          <w:bCs/>
-        </w:rPr>
-        <w:t xml:space="preserve">Roth, G. (2003).</w:t>
-      </w:r>
-      <w:r>
-        <w:t xml:space="preserve"> </w:t>
-      </w:r>
-      <w:r>
-        <w:rPr>
-          <w:i/>
-          <w:iCs/>
-        </w:rPr>
-        <w:t xml:space="preserve">Aus Sicht des Gehirns.</w:t>
-      </w:r>
-      <w:r>
-        <w:t xml:space="preserve"> </w:t>
-      </w:r>
-      <w:r>
-        <w:t xml:space="preserve">Suhrkamp Verlag, Frankfurt am Main.</w:t>
-      </w:r>
-    </w:p>
-    <w:p>
-      <w:pPr>
-        <w:pStyle w:val="Compact"/>
-        <w:numPr>
-          <w:ilvl w:val="0"/>
-          <w:numId w:val="1008"/>
-        </w:numPr>
-      </w:pPr>
-      <w:r>
-        <w:rPr>
-          <w:b/>
-          <w:bCs/>
-        </w:rPr>
-        <w:t xml:space="preserve">Roth, G. (2021).</w:t>
-      </w:r>
-      <w:r>
-        <w:t xml:space="preserve"> </w:t>
-      </w:r>
-      <w:r>
-        <w:rPr>
-          <w:i/>
-          <w:iCs/>
-        </w:rPr>
-        <w:t xml:space="preserve">Wie das Gehirn die Seele macht: Emotionen, Bewusstsein, Unbewusstes.</w:t>
-      </w:r>
-      <w:r>
-        <w:t xml:space="preserve"> </w:t>
-      </w:r>
-      <w:r>
-        <w:t xml:space="preserve">Klett-Cotta, Stuttgart.</w:t>
-      </w:r>
-    </w:p>
-    <w:p>
-      <w:pPr>
-        <w:pStyle w:val="Compact"/>
-        <w:numPr>
-          <w:ilvl w:val="0"/>
-          <w:numId w:val="1008"/>
-        </w:numPr>
-      </w:pPr>
-      <w:r>
-        <w:rPr>
-          <w:b/>
-          <w:bCs/>
-        </w:rPr>
-        <w:t xml:space="preserve">Spinoza, B. (1677).</w:t>
-      </w:r>
-      <w:r>
-        <w:t xml:space="preserve"> </w:t>
-      </w:r>
-      <w:r>
-        <w:rPr>
-          <w:i/>
-          <w:iCs/>
-        </w:rPr>
-        <w:t xml:space="preserve">Ethica, ordine geometrico demonstrata.</w:t>
-      </w:r>
-      <w:r>
-        <w:t xml:space="preserve"> </w:t>
-      </w:r>
-      <w:r>
-        <w:t xml:space="preserve">Posthumous Publication (Proposition 6 &amp; 7:</w:t>
-      </w:r>
-      <w:r>
-        <w:t xml:space="preserve"> </w:t>
-      </w:r>
-      <w:r>
-        <w:rPr>
-          <w:i/>
-          <w:iCs/>
-        </w:rPr>
-        <w:t xml:space="preserve">Conatus</w:t>
-      </w:r>
-      <w:r>
-        <w:t xml:space="preserve"> </w:t>
-      </w:r>
-      <w:r>
-        <w:t xml:space="preserve">as the intrinsic endeavor of every entity to persist in its own being).</w:t>
-      </w:r>
-    </w:p>
-    <w:p>
-      <w:pPr>
-        <w:pStyle w:val="Compact"/>
-        <w:numPr>
-          <w:ilvl w:val="0"/>
-          <w:numId w:val="1008"/>
-        </w:numPr>
-      </w:pPr>
-      <w:r>
-        <w:rPr>
-          <w:b/>
-          <w:bCs/>
-        </w:rPr>
-        <w:t xml:space="preserve">Tononi, G., Boly, M., Massimini, M., &amp; Koch, C. (2016).</w:t>
-      </w:r>
-      <w:r>
-        <w:t xml:space="preserve"> </w:t>
-      </w:r>
-      <w:r>
-        <w:rPr>
-          <w:i/>
-          <w:iCs/>
-        </w:rPr>
-        <w:t xml:space="preserve">Integrated information theory: from consciousness to its physical substrate.</w:t>
-      </w:r>
-      <w:r>
-        <w:t xml:space="preserve"> </w:t>
-      </w:r>
-      <w:r>
-        <w:t xml:space="preserve">Nature Reviews Neuroscience, 17(7), 450–461.</w:t>
-      </w:r>
-    </w:p>
-    <w:p>
-      <w:r>
-        <w:pict>
-          <v:rect style="width:0;height:1.5pt" o:hralign="center" o:hrstd="t" o:hr="t"/>
-        </w:pict>
-      </w:r>
-    </w:p>
-    <w:bookmarkEnd w:id="42"/>
-    <w:bookmarkStart w:id="48" w:name="tool-attribution-colophon"/>
-    <w:p>
-      <w:pPr>
-        <w:pStyle w:val="Heading2"/>
-      </w:pPr>
-      <w:r>
-        <w:t xml:space="preserve">8. Tool Attribution &amp; Colophon</w:t>
-      </w:r>
-    </w:p>
-    <w:p>
-      <w:pPr>
-        <w:pStyle w:val="BlockText"/>
-      </w:pPr>
-      <w:r>
-        <w:t xml:space="preserve">[!NOTE]</w:t>
-      </w:r>
-      <w:r>
-        <w:t xml:space="preserve"> </w:t>
-      </w:r>
-      <w:r>
-        <w:rPr>
-          <w:b/>
-          <w:bCs/>
-        </w:rPr>
-        <w:t xml:space="preserve">Tooling Colophon:</w:t>
-      </w:r>
-      <w:r>
-        <w:br/>
-      </w:r>
-      <w:r>
-        <w:t xml:space="preserve">This theoretical paper, mathematical synthesis, and computational Python simulation model were conceptualized and authored by</w:t>
-      </w:r>
-      <w:r>
-        <w:t xml:space="preserve"> </w:t>
-      </w:r>
-      <w:r>
-        <w:rPr>
-          <w:b/>
-          <w:bCs/>
-        </w:rPr>
-        <w:t xml:space="preserve">Thomas Riebl</w:t>
-      </w:r>
-      <w:r>
-        <w:t xml:space="preserve"> </w:t>
-      </w:r>
-      <w:r>
-        <w:t xml:space="preserve">(Luxembourg).</w:t>
-      </w:r>
-      <w:r>
-        <w:br/>
-      </w:r>
-      <w:r>
-        <w:t xml:space="preserve">The computational formulation, code implementation, vector diagram styling, and multi-format document compilation (Word</w:t>
-      </w:r>
-      <w:r>
-        <w:t xml:space="preserve"> </w:t>
-      </w:r>
-      <w:r>
-        <w:rPr>
-          <w:rStyle w:val="VerbatimChar"/>
-        </w:rPr>
-        <w:t xml:space="preserve">.docx</w:t>
-      </w:r>
-      <w:r>
-        <w:t xml:space="preserve">, Print-Ready PDF, and Jupyter Notebook) were developed with the assistance of</w:t>
-      </w:r>
-      <w:r>
-        <w:t xml:space="preserve"> </w:t>
-      </w:r>
-      <w:r>
-        <w:rPr>
-          <w:b/>
-          <w:bCs/>
-        </w:rPr>
-        <w:t xml:space="preserve">Google Gemini (Antigravity Advanced Agentic Coding System)</w:t>
-      </w:r>
-      <w:r>
-        <w:t xml:space="preserve"> </w:t>
-      </w:r>
-      <w:r>
-        <w:t xml:space="preserve">(August 2026).</w:t>
-      </w:r>
-    </w:p>
-    <w:p>
-      <w:r>
-        <w:pict>
-          <v:rect style="width:0;height:1.5pt" o:hralign="center" o:hrstd="t" o:hr="t"/>
-        </w:pict>
-      </w:r>
-    </w:p>
-    <w:bookmarkStart w:id="47" w:name="vault-repository-references"/>
-    <w:p>
-      <w:pPr>
-        <w:pStyle w:val="Heading3"/>
-      </w:pPr>
-      <w:r>
-        <w:t xml:space="preserve">Vault &amp; Repository References</w:t>
+        <w:t xml:space="preserve">8. References &amp; Academic Bibliography</w:t>
       </w:r>
     </w:p>
     <w:p>
@@ -4959,12 +5474,615 @@
           <w:b/>
           <w:bCs/>
         </w:rPr>
+        <w:t xml:space="preserve">Albantakis, L., Barbosa, L., Findlay, G., Grasso, M., Haun, A. M., Marshall, W., Mayner, W. G., Saeed, A. B., &amp; Tononi, G. (2023).</w:t>
+      </w:r>
+      <w:r>
+        <w:t xml:space="preserve"> </w:t>
+      </w:r>
+      <w:r>
+        <w:rPr>
+          <w:i/>
+          <w:iCs/>
+        </w:rPr>
+        <w:t xml:space="preserve">Integrated information theory (IIT) 4.0: Formulating the properties of phenomenal existence in physical terms.</w:t>
+      </w:r>
+      <w:r>
+        <w:t xml:space="preserve"> </w:t>
+      </w:r>
+      <w:r>
+        <w:t xml:space="preserve">PLOS Computational Biology, 19(10), e1011465.</w:t>
+      </w:r>
+    </w:p>
+    <w:p>
+      <w:pPr>
+        <w:pStyle w:val="Compact"/>
+        <w:numPr>
+          <w:ilvl w:val="0"/>
+          <w:numId w:val="1009"/>
+        </w:numPr>
+      </w:pPr>
+      <w:r>
+        <w:rPr>
+          <w:b/>
+          <w:bCs/>
+        </w:rPr>
+        <w:t xml:space="preserve">Barrett, A. B., &amp; Seth, A. K. (2011).</w:t>
+      </w:r>
+      <w:r>
+        <w:t xml:space="preserve"> </w:t>
+      </w:r>
+      <w:r>
+        <w:rPr>
+          <w:i/>
+          <w:iCs/>
+        </w:rPr>
+        <w:t xml:space="preserve">Practical measures of integrated information for time-series data.</w:t>
+      </w:r>
+      <w:r>
+        <w:t xml:space="preserve"> </w:t>
+      </w:r>
+      <w:r>
+        <w:t xml:space="preserve">PLoS Computational Biology, 7(1), e1001052.</w:t>
+      </w:r>
+    </w:p>
+    <w:p>
+      <w:pPr>
+        <w:pStyle w:val="Compact"/>
+        <w:numPr>
+          <w:ilvl w:val="0"/>
+          <w:numId w:val="1009"/>
+        </w:numPr>
+      </w:pPr>
+      <w:r>
+        <w:rPr>
+          <w:b/>
+          <w:bCs/>
+        </w:rPr>
+        <w:t xml:space="preserve">Friston, K. (2010).</w:t>
+      </w:r>
+      <w:r>
+        <w:t xml:space="preserve"> </w:t>
+      </w:r>
+      <w:r>
+        <w:rPr>
+          <w:i/>
+          <w:iCs/>
+        </w:rPr>
+        <w:t xml:space="preserve">The free-energy principle: a unified brain theory?</w:t>
+      </w:r>
+      <w:r>
+        <w:t xml:space="preserve"> </w:t>
+      </w:r>
+      <w:r>
+        <w:t xml:space="preserve">Nature Reviews Neuroscience, 11(2), 127–138.</w:t>
+      </w:r>
+    </w:p>
+    <w:p>
+      <w:pPr>
+        <w:pStyle w:val="Compact"/>
+        <w:numPr>
+          <w:ilvl w:val="0"/>
+          <w:numId w:val="1009"/>
+        </w:numPr>
+      </w:pPr>
+      <w:r>
+        <w:rPr>
+          <w:b/>
+          <w:bCs/>
+        </w:rPr>
+        <w:t xml:space="preserve">Friston, K., FitzGerald, T., Rigoli, F., Schwartenbeck, P., &amp; Pezzulo, G. (2017).</w:t>
+      </w:r>
+      <w:r>
+        <w:t xml:space="preserve"> </w:t>
+      </w:r>
+      <w:r>
+        <w:rPr>
+          <w:i/>
+          <w:iCs/>
+        </w:rPr>
+        <w:t xml:space="preserve">Active Inference: A Process Theory.</w:t>
+      </w:r>
+      <w:r>
+        <w:t xml:space="preserve"> </w:t>
+      </w:r>
+      <w:r>
+        <w:t xml:space="preserve">Neural Computation, 29(1), 1–49.</w:t>
+      </w:r>
+    </w:p>
+    <w:p>
+      <w:pPr>
+        <w:pStyle w:val="Compact"/>
+        <w:numPr>
+          <w:ilvl w:val="0"/>
+          <w:numId w:val="1009"/>
+        </w:numPr>
+      </w:pPr>
+      <w:r>
+        <w:rPr>
+          <w:b/>
+          <w:bCs/>
+        </w:rPr>
+        <w:t xml:space="preserve">Kastrup, B. (2018).</w:t>
+      </w:r>
+      <w:r>
+        <w:t xml:space="preserve"> </w:t>
+      </w:r>
+      <w:r>
+        <w:rPr>
+          <w:i/>
+          <w:iCs/>
+        </w:rPr>
+        <w:t xml:space="preserve">Making Sense of the Mind-Body Relation: Why Dual-Aspect Monism Cannot Evade Analytic Idealism.</w:t>
+      </w:r>
+      <w:r>
+        <w:t xml:space="preserve"> </w:t>
+      </w:r>
+      <w:r>
+        <w:t xml:space="preserve">Theoria et Historia Scientiarum, 15, 63–82.</w:t>
+      </w:r>
+    </w:p>
+    <w:p>
+      <w:pPr>
+        <w:pStyle w:val="Compact"/>
+        <w:numPr>
+          <w:ilvl w:val="0"/>
+          <w:numId w:val="1009"/>
+        </w:numPr>
+      </w:pPr>
+      <w:r>
+        <w:rPr>
+          <w:b/>
+          <w:bCs/>
+        </w:rPr>
+        <w:t xml:space="preserve">Kastrup, B. (2019).</w:t>
+      </w:r>
+      <w:r>
+        <w:t xml:space="preserve"> </w:t>
+      </w:r>
+      <w:r>
+        <w:rPr>
+          <w:i/>
+          <w:iCs/>
+        </w:rPr>
+        <w:t xml:space="preserve">The Idea of the World: A Multi-Disciplinary Argument for the Mental Nature of Reality.</w:t>
+      </w:r>
+      <w:r>
+        <w:t xml:space="preserve"> </w:t>
+      </w:r>
+      <w:r>
+        <w:t xml:space="preserve">Iff Books.</w:t>
+      </w:r>
+    </w:p>
+    <w:p>
+      <w:pPr>
+        <w:pStyle w:val="Compact"/>
+        <w:numPr>
+          <w:ilvl w:val="0"/>
+          <w:numId w:val="1009"/>
+        </w:numPr>
+      </w:pPr>
+      <w:r>
+        <w:rPr>
+          <w:b/>
+          <w:bCs/>
+        </w:rPr>
+        <w:t xml:space="preserve">Koch, C. (2019).</w:t>
+      </w:r>
+      <w:r>
+        <w:t xml:space="preserve"> </w:t>
+      </w:r>
+      <w:r>
+        <w:rPr>
+          <w:i/>
+          <w:iCs/>
+        </w:rPr>
+        <w:t xml:space="preserve">The Feeling of Life Itself: Why Consciousness Is Widespread but Can’t Be Computed.</w:t>
+      </w:r>
+      <w:r>
+        <w:t xml:space="preserve"> </w:t>
+      </w:r>
+      <w:r>
+        <w:t xml:space="preserve">MIT Press.</w:t>
+      </w:r>
+    </w:p>
+    <w:p>
+      <w:pPr>
+        <w:pStyle w:val="Compact"/>
+        <w:numPr>
+          <w:ilvl w:val="0"/>
+          <w:numId w:val="1009"/>
+        </w:numPr>
+      </w:pPr>
+      <w:r>
+        <w:rPr>
+          <w:b/>
+          <w:bCs/>
+        </w:rPr>
+        <w:t xml:space="preserve">Metzinger, T. (2003).</w:t>
+      </w:r>
+      <w:r>
+        <w:t xml:space="preserve"> </w:t>
+      </w:r>
+      <w:r>
+        <w:rPr>
+          <w:i/>
+          <w:iCs/>
+        </w:rPr>
+        <w:t xml:space="preserve">Being No One: The Self-Model Theory of Subjectivity.</w:t>
+      </w:r>
+      <w:r>
+        <w:t xml:space="preserve"> </w:t>
+      </w:r>
+      <w:r>
+        <w:t xml:space="preserve">MIT Press.</w:t>
+      </w:r>
+    </w:p>
+    <w:p>
+      <w:pPr>
+        <w:pStyle w:val="Compact"/>
+        <w:numPr>
+          <w:ilvl w:val="0"/>
+          <w:numId w:val="1009"/>
+        </w:numPr>
+      </w:pPr>
+      <w:r>
+        <w:rPr>
+          <w:b/>
+          <w:bCs/>
+        </w:rPr>
+        <w:t xml:space="preserve">Metzinger, T. (2024).</w:t>
+      </w:r>
+      <w:r>
+        <w:t xml:space="preserve"> </w:t>
+      </w:r>
+      <w:r>
+        <w:rPr>
+          <w:i/>
+          <w:iCs/>
+        </w:rPr>
+        <w:t xml:space="preserve">The Elephant and the Blind: The Experience of Pure Consciousness: Philosophy, Science, and 500+ Experiential Reports.</w:t>
+      </w:r>
+      <w:r>
+        <w:t xml:space="preserve"> </w:t>
+      </w:r>
+      <w:r>
+        <w:t xml:space="preserve">MIT Press.</w:t>
+      </w:r>
+    </w:p>
+    <w:p>
+      <w:pPr>
+        <w:pStyle w:val="Compact"/>
+        <w:numPr>
+          <w:ilvl w:val="0"/>
+          <w:numId w:val="1009"/>
+        </w:numPr>
+      </w:pPr>
+      <w:r>
+        <w:rPr>
+          <w:b/>
+          <w:bCs/>
+        </w:rPr>
+        <w:t xml:space="preserve">Oizumi, M., Amari, S. I., Yanagawa, T., Fujii, N., &amp; Tsuchiya, N. (2016).</w:t>
+      </w:r>
+      <w:r>
+        <w:t xml:space="preserve"> </w:t>
+      </w:r>
+      <w:r>
+        <w:rPr>
+          <w:i/>
+          <w:iCs/>
+        </w:rPr>
+        <w:t xml:space="preserve">Measuring Integrated Information from the Decoding Perspective.</w:t>
+      </w:r>
+      <w:r>
+        <w:t xml:space="preserve"> </w:t>
+      </w:r>
+      <w:r>
+        <w:t xml:space="preserve">PLoS Computational Biology, 12(1), e1004654.</w:t>
+      </w:r>
+    </w:p>
+    <w:p>
+      <w:pPr>
+        <w:pStyle w:val="Compact"/>
+        <w:numPr>
+          <w:ilvl w:val="0"/>
+          <w:numId w:val="1009"/>
+        </w:numPr>
+      </w:pPr>
+      <w:r>
+        <w:rPr>
+          <w:b/>
+          <w:bCs/>
+        </w:rPr>
+        <w:t xml:space="preserve">Riebl, T. (2026).</w:t>
+      </w:r>
+      <w:r>
+        <w:t xml:space="preserve"> </w:t>
+      </w:r>
+      <w:r>
+        <w:rPr>
+          <w:i/>
+          <w:iCs/>
+        </w:rPr>
+        <w:t xml:space="preserve">Expanding IIT 4.0’s Axiom 0: The 6th Axiom of Autopoietic Causal Persistence (Will to Exist).</w:t>
+      </w:r>
+      <w:r>
+        <w:t xml:space="preserve"> </w:t>
+      </w:r>
+      <w:r>
+        <w:t xml:space="preserve">Working Paper &amp; Formal Proposal, Luxembourg.</w:t>
+      </w:r>
+    </w:p>
+    <w:p>
+      <w:pPr>
+        <w:pStyle w:val="Compact"/>
+        <w:numPr>
+          <w:ilvl w:val="0"/>
+          <w:numId w:val="1009"/>
+        </w:numPr>
+      </w:pPr>
+      <w:r>
+        <w:rPr>
+          <w:b/>
+          <w:bCs/>
+        </w:rPr>
+        <w:t xml:space="preserve">Roth, G. (2003).</w:t>
+      </w:r>
+      <w:r>
+        <w:t xml:space="preserve"> </w:t>
+      </w:r>
+      <w:r>
+        <w:rPr>
+          <w:i/>
+          <w:iCs/>
+        </w:rPr>
+        <w:t xml:space="preserve">Aus Sicht des Gehirns.</w:t>
+      </w:r>
+      <w:r>
+        <w:t xml:space="preserve"> </w:t>
+      </w:r>
+      <w:r>
+        <w:t xml:space="preserve">Suhrkamp Verlag, Frankfurt am Main.</w:t>
+      </w:r>
+    </w:p>
+    <w:p>
+      <w:pPr>
+        <w:pStyle w:val="Compact"/>
+        <w:numPr>
+          <w:ilvl w:val="0"/>
+          <w:numId w:val="1009"/>
+        </w:numPr>
+      </w:pPr>
+      <w:r>
+        <w:rPr>
+          <w:b/>
+          <w:bCs/>
+        </w:rPr>
+        <w:t xml:space="preserve">Roth, G. (2021).</w:t>
+      </w:r>
+      <w:r>
+        <w:t xml:space="preserve"> </w:t>
+      </w:r>
+      <w:r>
+        <w:rPr>
+          <w:i/>
+          <w:iCs/>
+        </w:rPr>
+        <w:t xml:space="preserve">Wie das Gehirn die Seele macht: Emotionen, Bewusstsein, Unbewusstes.</w:t>
+      </w:r>
+      <w:r>
+        <w:t xml:space="preserve"> </w:t>
+      </w:r>
+      <w:r>
+        <w:t xml:space="preserve">Klett-Cotta, Stuttgart.</w:t>
+      </w:r>
+    </w:p>
+    <w:p>
+      <w:pPr>
+        <w:pStyle w:val="Compact"/>
+        <w:numPr>
+          <w:ilvl w:val="0"/>
+          <w:numId w:val="1009"/>
+        </w:numPr>
+      </w:pPr>
+      <w:r>
+        <w:rPr>
+          <w:b/>
+          <w:bCs/>
+        </w:rPr>
+        <w:t xml:space="preserve">Spinoza, B. (1677).</w:t>
+      </w:r>
+      <w:r>
+        <w:t xml:space="preserve"> </w:t>
+      </w:r>
+      <w:r>
+        <w:rPr>
+          <w:i/>
+          <w:iCs/>
+        </w:rPr>
+        <w:t xml:space="preserve">Ethica, ordine geometrico demonstrata.</w:t>
+      </w:r>
+      <w:r>
+        <w:t xml:space="preserve"> </w:t>
+      </w:r>
+      <w:r>
+        <w:t xml:space="preserve">Posthumous Publication (Proposition 6 &amp; 7:</w:t>
+      </w:r>
+      <w:r>
+        <w:t xml:space="preserve"> </w:t>
+      </w:r>
+      <w:r>
+        <w:rPr>
+          <w:i/>
+          <w:iCs/>
+        </w:rPr>
+        <w:t xml:space="preserve">Conatus</w:t>
+      </w:r>
+      <w:r>
+        <w:t xml:space="preserve"> </w:t>
+      </w:r>
+      <w:r>
+        <w:t xml:space="preserve">as the intrinsic endeavor of every entity to persist in its own being).</w:t>
+      </w:r>
+    </w:p>
+    <w:p>
+      <w:pPr>
+        <w:pStyle w:val="Compact"/>
+        <w:numPr>
+          <w:ilvl w:val="0"/>
+          <w:numId w:val="1009"/>
+        </w:numPr>
+      </w:pPr>
+      <w:r>
+        <w:rPr>
+          <w:b/>
+          <w:bCs/>
+        </w:rPr>
+        <w:t xml:space="preserve">Tononi, G., Boly, M., Massimini, M., &amp; Koch, C. (2016).</w:t>
+      </w:r>
+      <w:r>
+        <w:t xml:space="preserve"> </w:t>
+      </w:r>
+      <w:r>
+        <w:rPr>
+          <w:i/>
+          <w:iCs/>
+        </w:rPr>
+        <w:t xml:space="preserve">Integrated information theory: from consciousness to its physical substrate.</w:t>
+      </w:r>
+      <w:r>
+        <w:t xml:space="preserve"> </w:t>
+      </w:r>
+      <w:r>
+        <w:t xml:space="preserve">Nature Reviews Neuroscience, 17(7), 450–461.</w:t>
+      </w:r>
+    </w:p>
+    <w:p>
+      <w:r>
+        <w:pict>
+          <v:rect style="width:0;height:1.5pt" o:hralign="center" o:hrstd="t" o:hr="t"/>
+        </w:pict>
+      </w:r>
+    </w:p>
+    <w:bookmarkEnd w:id="47"/>
+    <w:bookmarkStart w:id="53" w:name="tool-attribution-colophon"/>
+    <w:p>
+      <w:pPr>
+        <w:pStyle w:val="Heading2"/>
+      </w:pPr>
+      <w:r>
+        <w:t xml:space="preserve">9. Tool Attribution &amp; Colophon</w:t>
+      </w:r>
+    </w:p>
+    <w:p>
+      <w:pPr>
+        <w:pStyle w:val="BlockText"/>
+      </w:pPr>
+      <w:r>
+        <w:t xml:space="preserve">[!NOTE]</w:t>
+      </w:r>
+      <w:r>
+        <w:t xml:space="preserve"> </w:t>
+      </w:r>
+      <w:r>
+        <w:rPr>
+          <w:b/>
+          <w:bCs/>
+        </w:rPr>
+        <w:t xml:space="preserve">Tooling Colophon:</w:t>
+      </w:r>
+      <w:r>
+        <w:br/>
+      </w:r>
+      <w:r>
+        <w:t xml:space="preserve">This theoretical paper, mathematical synthesis, and computational Python simulation model were conceptualized and authored by</w:t>
+      </w:r>
+      <w:r>
+        <w:t xml:space="preserve"> </w:t>
+      </w:r>
+      <w:r>
+        <w:rPr>
+          <w:b/>
+          <w:bCs/>
+        </w:rPr>
+        <w:t xml:space="preserve">Thomas Riebl</w:t>
+      </w:r>
+      <w:r>
+        <w:t xml:space="preserve"> </w:t>
+      </w:r>
+      <w:r>
+        <w:t xml:space="preserve">(Luxembourg).</w:t>
+      </w:r>
+      <w:r>
+        <w:br/>
+      </w:r>
+      <w:r>
+        <w:t xml:space="preserve">The computational formulation, code implementation, vector diagram styling, and multi-format document compilation (Word</w:t>
+      </w:r>
+      <w:r>
+        <w:t xml:space="preserve"> </w:t>
+      </w:r>
+      <w:r>
+        <w:rPr>
+          <w:rStyle w:val="VerbatimChar"/>
+        </w:rPr>
+        <w:t xml:space="preserve">.docx</w:t>
+      </w:r>
+      <w:r>
+        <w:t xml:space="preserve">, Print-Ready PDF, and Jupyter Notebook) were developed with the assistance of</w:t>
+      </w:r>
+      <w:r>
+        <w:t xml:space="preserve"> </w:t>
+      </w:r>
+      <w:r>
+        <w:rPr>
+          <w:b/>
+          <w:bCs/>
+        </w:rPr>
+        <w:t xml:space="preserve">Google Gemini (Antigravity Advanced Agentic Coding System)</w:t>
+      </w:r>
+      <w:r>
+        <w:t xml:space="preserve"> </w:t>
+      </w:r>
+      <w:r>
+        <w:t xml:space="preserve">(August 2026).</w:t>
+      </w:r>
+    </w:p>
+    <w:p>
+      <w:r>
+        <w:pict>
+          <v:rect style="width:0;height:1.5pt" o:hralign="center" o:hrstd="t" o:hr="t"/>
+        </w:pict>
+      </w:r>
+    </w:p>
+    <w:bookmarkStart w:id="52" w:name="vault-repository-references"/>
+    <w:p>
+      <w:pPr>
+        <w:pStyle w:val="Heading3"/>
+      </w:pPr>
+      <w:r>
+        <w:t xml:space="preserve">Vault &amp; Repository References</w:t>
+      </w:r>
+    </w:p>
+    <w:p>
+      <w:pPr>
+        <w:pStyle w:val="Compact"/>
+        <w:numPr>
+          <w:ilvl w:val="0"/>
+          <w:numId w:val="1010"/>
+        </w:numPr>
+      </w:pPr>
+      <w:r>
+        <w:rPr>
+          <w:b/>
+          <w:bCs/>
+        </w:rPr>
         <w:t xml:space="preserve">GitHub Project Repository:</w:t>
       </w:r>
       <w:r>
         <w:t xml:space="preserve"> </w:t>
       </w:r>
-      <w:hyperlink r:id="rId43">
+      <w:hyperlink r:id="rId48">
         <w:r>
           <w:rPr>
             <w:rStyle w:val="VerbatimChar"/>
@@ -4978,7 +6096,7 @@
         <w:pStyle w:val="Compact"/>
         <w:numPr>
           <w:ilvl w:val="0"/>
-          <w:numId w:val="1009"/>
+          <w:numId w:val="1010"/>
         </w:numPr>
       </w:pPr>
       <w:r>
@@ -4991,7 +6109,7 @@
       <w:r>
         <w:t xml:space="preserve"> </w:t>
       </w:r>
-      <w:hyperlink r:id="rId44">
+      <w:hyperlink r:id="rId49">
         <w:r>
           <w:rPr>
             <w:rStyle w:val="VerbatimChar"/>
@@ -5005,7 +6123,7 @@
         <w:pStyle w:val="Compact"/>
         <w:numPr>
           <w:ilvl w:val="0"/>
-          <w:numId w:val="1009"/>
+          <w:numId w:val="1010"/>
         </w:numPr>
       </w:pPr>
       <w:r>
@@ -5018,7 +6136,7 @@
       <w:r>
         <w:t xml:space="preserve"> </w:t>
       </w:r>
-      <w:hyperlink r:id="rId45">
+      <w:hyperlink r:id="rId50">
         <w:r>
           <w:rPr>
             <w:rStyle w:val="VerbatimChar"/>
@@ -5032,7 +6150,7 @@
         <w:pStyle w:val="Compact"/>
         <w:numPr>
           <w:ilvl w:val="0"/>
-          <w:numId w:val="1009"/>
+          <w:numId w:val="1010"/>
         </w:numPr>
       </w:pPr>
       <w:r>
@@ -5045,7 +6163,7 @@
       <w:r>
         <w:t xml:space="preserve"> </w:t>
       </w:r>
-      <w:hyperlink r:id="rId46">
+      <w:hyperlink r:id="rId51">
         <w:r>
           <w:rPr>
             <w:rStyle w:val="VerbatimChar"/>
@@ -5054,9 +6172,9 @@
         </w:r>
       </w:hyperlink>
     </w:p>
-    <w:bookmarkEnd w:id="47"/>
-    <w:bookmarkEnd w:id="48"/>
-    <w:bookmarkEnd w:id="49"/>
+    <w:bookmarkEnd w:id="52"/>
+    <w:bookmarkEnd w:id="53"/>
+    <w:bookmarkEnd w:id="54"/>
     <w:sectPr>
       <w:footnotePr>
         <w:numRestart w:val="eachSect"/>
@@ -5518,6 +6636,36 @@
     </w:lvlOverride>
   </w:num>
   <w:num w:numId="1009">
+    <w:abstractNumId w:val="99411"/>
+    <w:lvlOverride w:ilvl="0">
+      <w:startOverride w:val="1"/>
+    </w:lvlOverride>
+    <w:lvlOverride w:ilvl="1">
+      <w:startOverride w:val="1"/>
+    </w:lvlOverride>
+    <w:lvlOverride w:ilvl="2">
+      <w:startOverride w:val="1"/>
+    </w:lvlOverride>
+    <w:lvlOverride w:ilvl="3">
+      <w:startOverride w:val="1"/>
+    </w:lvlOverride>
+    <w:lvlOverride w:ilvl="4">
+      <w:startOverride w:val="1"/>
+    </w:lvlOverride>
+    <w:lvlOverride w:ilvl="5">
+      <w:startOverride w:val="1"/>
+    </w:lvlOverride>
+    <w:lvlOverride w:ilvl="6">
+      <w:startOverride w:val="1"/>
+    </w:lvlOverride>
+    <w:lvlOverride w:ilvl="7">
+      <w:startOverride w:val="1"/>
+    </w:lvlOverride>
+    <w:lvlOverride w:ilvl="8">
+      <w:startOverride w:val="1"/>
+    </w:lvlOverride>
+  </w:num>
+  <w:num w:numId="1010">
     <w:abstractNumId w:val="991"/>
   </w:num>
 </w:numbering>

</xml_diff>

<commit_message>
Reference Schopenhauer and use 'The Will to Exist' throughout CIF Master Paper
</commit_message>
<xml_diff>
--- a/docs/The_Conative_Integrative_Framework_Thomas_Riebl.docx
+++ b/docs/The_Conative_Integrative_Framework_Thomas_Riebl.docx
@@ -685,49 +685,65 @@
         </m:r>
       </m:oMath>
       <w:r>
-        <w:t xml:space="preserve">) across a Markov Blanket is identically what Giulio Tononi and Thomas Riebl define from the</w:t>
-      </w:r>
-      <w:r>
-        <w:t xml:space="preserve"> </w:t>
-      </w:r>
-      <w:r>
-        <w:rPr>
-          <w:b/>
-          <w:bCs/>
-        </w:rPr>
-        <w:t xml:space="preserve">inside (1st-person)</w:t>
-      </w:r>
-      <w:r>
-        <w:t xml:space="preserve"> </w:t>
-      </w:r>
-      <w:r>
-        <w:t xml:space="preserve">as the</w:t>
-      </w:r>
-      <w:r>
-        <w:t xml:space="preserve"> </w:t>
-      </w:r>
-      <w:r>
-        <w:rPr>
-          <w:b/>
-          <w:bCs/>
-        </w:rPr>
-        <w:t xml:space="preserve">Will to Exist (</w:t>
-      </w:r>
-      <w:r>
-        <w:rPr>
-          <w:b/>
-          <w:bCs/>
+        <w:t xml:space="preserve">) across a Markov Blanket is identically what metaphysics and phenomenology (from Spinoza’s</w:t>
+      </w:r>
+      <w:r>
+        <w:t xml:space="preserve"> </w:t>
+      </w:r>
+      <w:r>
+        <w:rPr>
           <w:i/>
           <w:iCs/>
         </w:rPr>
         <w:t xml:space="preserve">Conatus</w:t>
       </w:r>
       <w:r>
-        <w:rPr>
-          <w:b/>
-          <w:bCs/>
-        </w:rPr>
-        <w:t xml:space="preserve">)</w:t>
+        <w:t xml:space="preserve"> </w:t>
+      </w:r>
+      <w:r>
+        <w:t xml:space="preserve">and Schopenhauer’s</w:t>
+      </w:r>
+      <w:r>
+        <w:t xml:space="preserve"> </w:t>
+      </w:r>
+      <w:r>
+        <w:rPr>
+          <w:i/>
+          <w:iCs/>
+        </w:rPr>
+        <w:t xml:space="preserve">Wille zum Leben</w:t>
+      </w:r>
+      <w:r>
+        <w:t xml:space="preserve"> </w:t>
+      </w:r>
+      <w:r>
+        <w:t xml:space="preserve">to the 6th Axiom of IIT) define from the</w:t>
+      </w:r>
+      <w:r>
+        <w:t xml:space="preserve"> </w:t>
+      </w:r>
+      <w:r>
+        <w:rPr>
+          <w:b/>
+          <w:bCs/>
+        </w:rPr>
+        <w:t xml:space="preserve">inside (1st-person)</w:t>
+      </w:r>
+      <w:r>
+        <w:t xml:space="preserve"> </w:t>
+      </w:r>
+      <w:r>
+        <w:t xml:space="preserve">as</w:t>
+      </w:r>
+      <w:r>
+        <w:t xml:space="preserve"> </w:t>
+      </w:r>
+      <w:r>
+        <w:rPr>
+          <w:b/>
+          <w:bCs/>
+        </w:rPr>
+        <w:t xml:space="preserve">The Will to Exist</w:t>
       </w:r>
       <w:r>
         <w:t xml:space="preserve"> </w:t>
@@ -910,7 +926,7 @@
       <w:r>
         <w:drawing>
           <wp:inline>
-            <wp:extent cx="5334000" cy="3461247"/>
+            <wp:extent cx="5334000" cy="3335840"/>
             <wp:effectExtent b="0" l="0" r="0" t="0"/>
             <wp:docPr descr="Diagram 2" title="" id="17" name="Picture"/>
             <a:graphic>
@@ -931,7 +947,7 @@
                   <pic:spPr bwMode="auto">
                     <a:xfrm>
                       <a:off x="0" y="0"/>
-                      <a:ext cx="5334000" cy="3461247"/>
+                      <a:ext cx="5334000" cy="3335840"/>
                     </a:xfrm>
                     <a:prstGeom prst="rect">
                       <a:avLst/>
@@ -2136,7 +2152,7 @@
           <w:b/>
           <w:bCs/>
         </w:rPr>
-        <w:t xml:space="preserve">Free Energy Minimization is the physical mechanism by which the Will to Exist maintains conscious causal coherence</w:t>
+        <w:t xml:space="preserve">Free Energy Minimization is the physical mechanism by which The Will to Exist maintains conscious causal coherence</w:t>
       </w:r>
       <w:r>
         <w:t xml:space="preserve">.</w:t>
@@ -3233,10 +3249,20 @@
         <w:t xml:space="preserve">Conatus</w:t>
       </w:r>
       <w:r>
-        <w:t xml:space="preserve"> </w:t>
-      </w:r>
-      <w:r>
-        <w:t xml:space="preserve">and Riebl’s</w:t>
+        <w:t xml:space="preserve">, Schopenhauer’s</w:t>
+      </w:r>
+      <w:r>
+        <w:t xml:space="preserve"> </w:t>
+      </w:r>
+      <w:r>
+        <w:rPr>
+          <w:i/>
+          <w:iCs/>
+        </w:rPr>
+        <w:t xml:space="preserve">Will to Live (Wille zum Leben)</w:t>
+      </w:r>
+      <w:r>
+        <w:t xml:space="preserve">, and the autopoietic</w:t>
       </w:r>
       <w:r>
         <w:t xml:space="preserve"> </w:t>
@@ -5890,6 +5916,38 @@
           <w:b/>
           <w:bCs/>
         </w:rPr>
+        <w:t xml:space="preserve">Schopenhauer, A. (1819/1844).</w:t>
+      </w:r>
+      <w:r>
+        <w:t xml:space="preserve"> </w:t>
+      </w:r>
+      <w:r>
+        <w:rPr>
+          <w:i/>
+          <w:iCs/>
+        </w:rPr>
+        <w:t xml:space="preserve">Die Welt als Wille und Vorstellung (The World as Will and Representation).</w:t>
+      </w:r>
+      <w:r>
+        <w:t xml:space="preserve"> </w:t>
+      </w:r>
+      <w:r>
+        <w:t xml:space="preserve">F. A. Brockhaus, Leipzig. (The metaphysical Will as the primary, noumenal essence of reality and living organisms).</w:t>
+      </w:r>
+    </w:p>
+    <w:p>
+      <w:pPr>
+        <w:pStyle w:val="Compact"/>
+        <w:numPr>
+          <w:ilvl w:val="0"/>
+          <w:numId w:val="1009"/>
+        </w:numPr>
+      </w:pPr>
+      <w:r>
+        <w:rPr>
+          <w:b/>
+          <w:bCs/>
+        </w:rPr>
         <w:t xml:space="preserve">Spinoza, B. (1677).</w:t>
       </w:r>
       <w:r>

</xml_diff>